<commit_message>
edge_attr létrehozása és modell elkezdése
</commit_message>
<xml_diff>
--- a/Beadando terv.docx
+++ b/Beadando terv.docx
@@ -3,14 +3,34 @@
 <w:document xmlns:wpc="http://schemas.microsoft.com/office/word/2010/wordprocessingCanvas" xmlns:cx="http://schemas.microsoft.com/office/drawing/2014/chartex" xmlns:cx1="http://schemas.microsoft.com/office/drawing/2015/9/8/chartex" xmlns:cx2="http://schemas.microsoft.com/office/drawing/2015/10/21/chartex" xmlns:cx3="http://schemas.microsoft.com/office/drawing/2016/5/9/chartex" xmlns:cx4="http://schemas.microsoft.com/office/drawing/2016/5/10/chartex" xmlns:cx5="http://schemas.microsoft.com/office/drawing/2016/5/11/chartex" xmlns:cx6="http://schemas.microsoft.com/office/drawing/2016/5/12/chartex" xmlns:cx7="http://schemas.microsoft.com/office/drawing/2016/5/13/chartex" xmlns:cx8="http://schemas.microsoft.com/office/drawing/2016/5/14/chartex" xmlns:mc="http://schemas.openxmlformats.org/markup-compatibility/2006" xmlns:aink="http://schemas.microsoft.com/office/drawing/2016/ink" xmlns:am3d="http://schemas.microsoft.com/office/drawing/2017/model3d" xmlns:o="urn:schemas-microsoft-com:office:office" xmlns:oel="http://schemas.microsoft.com/office/2019/extlst" xmlns:r="http://schemas.openxmlformats.org/officeDocument/2006/relationships" xmlns:m="http://schemas.openxmlformats.org/officeDocument/2006/math" xmlns:v="urn:schemas-microsoft-com:vml" xmlns:wp14="http://schemas.microsoft.com/office/word/2010/wordprocessingDrawing" xmlns:wp="http://schemas.openxmlformats.org/drawingml/2006/wordprocessingDrawing" xmlns:w10="urn:schemas-microsoft-com:office:word" xmlns:w="http://schemas.openxmlformats.org/wordprocessingml/2006/main" xmlns:w14="http://schemas.microsoft.com/office/word/2010/wordml" xmlns:w15="http://schemas.microsoft.com/office/word/2012/wordml" xmlns:w16cex="http://schemas.microsoft.com/office/word/2018/wordml/cex" xmlns:w16cid="http://schemas.microsoft.com/office/word/2016/wordml/cid" xmlns:w16="http://schemas.microsoft.com/office/word/2018/wordml" xmlns:w16du="http://schemas.microsoft.com/office/word/2023/wordml/word16du" xmlns:w16sdtdh="http://schemas.microsoft.com/office/word/2020/wordml/sdtdatahash" xmlns:w16sdtfl="http://schemas.microsoft.com/office/word/2024/wordml/sdtformatlock" xmlns:w16se="http://schemas.microsoft.com/office/word/2015/wordml/symex" xmlns:wpg="http://schemas.microsoft.com/office/word/2010/wordprocessingGroup" xmlns:wpi="http://schemas.microsoft.com/office/word/2010/wordprocessingInk" xmlns:wne="http://schemas.microsoft.com/office/word/2006/wordml" xmlns:wps="http://schemas.microsoft.com/office/word/2010/wordprocessingShape" mc:Ignorable="w14 w15 w16se w16cid w16 w16cex w16sdtdh w16sdtfl w16du wp14">
   <w:body>
     <w:p>
-      <w:r>
-        <w:t>Hallgató neve:</w:t>
-      </w:r>
-      <w:r>
-        <w:t xml:space="preserve"> </w:t>
-      </w:r>
-      <w:r>
-        <w:rPr>
+      <w:pPr>
+        <w:pStyle w:val="Cmsor1"/>
+        <w:rPr>
+          <w:rFonts w:ascii="Times New Roman" w:hAnsi="Times New Roman" w:cs="Times New Roman"/>
+        </w:rPr>
+      </w:pPr>
+      <w:r>
+        <w:rPr>
+          <w:rFonts w:ascii="Times New Roman" w:hAnsi="Times New Roman" w:cs="Times New Roman"/>
+        </w:rPr>
+        <w:t>Munkaterv</w:t>
+      </w:r>
+    </w:p>
+    <w:p>
+      <w:pPr>
+        <w:rPr>
+          <w:rFonts w:ascii="Times New Roman" w:hAnsi="Times New Roman" w:cs="Times New Roman"/>
+        </w:rPr>
+      </w:pPr>
+      <w:r>
+        <w:rPr>
+          <w:rFonts w:ascii="Times New Roman" w:hAnsi="Times New Roman" w:cs="Times New Roman"/>
+        </w:rPr>
+        <w:t xml:space="preserve">Hallgató neve: </w:t>
+      </w:r>
+      <w:r>
+        <w:rPr>
+          <w:rFonts w:ascii="Times New Roman" w:hAnsi="Times New Roman" w:cs="Times New Roman"/>
           <w:b/>
           <w:bCs/>
         </w:rPr>
@@ -18,19 +38,20 @@
       </w:r>
     </w:p>
     <w:p>
-      <w:proofErr w:type="spellStart"/>
-      <w:r>
-        <w:t>Neptun</w:t>
-      </w:r>
-      <w:proofErr w:type="spellEnd"/>
-      <w:r>
-        <w:t xml:space="preserve"> kódja:</w:t>
-      </w:r>
-      <w:r>
-        <w:t xml:space="preserve"> </w:t>
-      </w:r>
-      <w:r>
-        <w:rPr>
+      <w:pPr>
+        <w:rPr>
+          <w:rFonts w:ascii="Times New Roman" w:hAnsi="Times New Roman" w:cs="Times New Roman"/>
+        </w:rPr>
+      </w:pPr>
+      <w:r>
+        <w:rPr>
+          <w:rFonts w:ascii="Times New Roman" w:hAnsi="Times New Roman" w:cs="Times New Roman"/>
+        </w:rPr>
+        <w:t xml:space="preserve">Neptun kódja: </w:t>
+      </w:r>
+      <w:r>
+        <w:rPr>
+          <w:rFonts w:ascii="Times New Roman" w:hAnsi="Times New Roman" w:cs="Times New Roman"/>
           <w:b/>
           <w:bCs/>
         </w:rPr>
@@ -38,14 +59,20 @@
       </w:r>
     </w:p>
     <w:p>
-      <w:r>
-        <w:t>Email címe:</w:t>
-      </w:r>
-      <w:r>
-        <w:t xml:space="preserve"> </w:t>
-      </w:r>
-      <w:r>
-        <w:rPr>
+      <w:pPr>
+        <w:rPr>
+          <w:rFonts w:ascii="Times New Roman" w:hAnsi="Times New Roman" w:cs="Times New Roman"/>
+        </w:rPr>
+      </w:pPr>
+      <w:r>
+        <w:rPr>
+          <w:rFonts w:ascii="Times New Roman" w:hAnsi="Times New Roman" w:cs="Times New Roman"/>
+        </w:rPr>
+        <w:t xml:space="preserve">Email címe: </w:t>
+      </w:r>
+      <w:r>
+        <w:rPr>
+          <w:rFonts w:ascii="Times New Roman" w:hAnsi="Times New Roman" w:cs="Times New Roman"/>
           <w:b/>
           <w:bCs/>
         </w:rPr>
@@ -53,22 +80,20 @@
       </w:r>
     </w:p>
     <w:p>
-      <w:r>
-        <w:t>Konzulens(</w:t>
-      </w:r>
-      <w:proofErr w:type="spellStart"/>
-      <w:r>
-        <w:t>ek</w:t>
-      </w:r>
-      <w:proofErr w:type="spellEnd"/>
-      <w:r>
-        <w:t>) neve:</w:t>
-      </w:r>
-      <w:r>
-        <w:t xml:space="preserve"> </w:t>
-      </w:r>
-      <w:r>
-        <w:rPr>
+      <w:pPr>
+        <w:rPr>
+          <w:rFonts w:ascii="Times New Roman" w:hAnsi="Times New Roman" w:cs="Times New Roman"/>
+        </w:rPr>
+      </w:pPr>
+      <w:r>
+        <w:rPr>
+          <w:rFonts w:ascii="Times New Roman" w:hAnsi="Times New Roman" w:cs="Times New Roman"/>
+        </w:rPr>
+        <w:t xml:space="preserve">Konzulens(ek) neve: </w:t>
+      </w:r>
+      <w:r>
+        <w:rPr>
+          <w:rFonts w:ascii="Times New Roman" w:hAnsi="Times New Roman" w:cs="Times New Roman"/>
           <w:b/>
           <w:bCs/>
         </w:rPr>
@@ -78,23 +103,20 @@
     <w:p>
       <w:pPr>
         <w:rPr>
+          <w:rFonts w:ascii="Times New Roman" w:hAnsi="Times New Roman" w:cs="Times New Roman"/>
           <w:b/>
           <w:bCs/>
         </w:rPr>
       </w:pPr>
-      <w:proofErr w:type="spellStart"/>
-      <w:r>
-        <w:t>Önlab</w:t>
-      </w:r>
-      <w:proofErr w:type="spellEnd"/>
-      <w:r>
-        <w:t xml:space="preserve"> tantárgy kódja:</w:t>
-      </w:r>
-      <w:r>
-        <w:t xml:space="preserve"> </w:t>
-      </w:r>
-      <w:r>
-        <w:rPr>
+      <w:r>
+        <w:rPr>
+          <w:rFonts w:ascii="Times New Roman" w:hAnsi="Times New Roman" w:cs="Times New Roman"/>
+        </w:rPr>
+        <w:t xml:space="preserve">Önlab tantárgy kódja: </w:t>
+      </w:r>
+      <w:r>
+        <w:rPr>
+          <w:rFonts w:ascii="Times New Roman" w:hAnsi="Times New Roman" w:cs="Times New Roman"/>
           <w:b/>
           <w:bCs/>
         </w:rPr>
@@ -102,14 +124,20 @@
       </w:r>
     </w:p>
     <w:p>
-      <w:r>
-        <w:t>Tanév/félév:</w:t>
-      </w:r>
-      <w:r>
-        <w:t xml:space="preserve"> </w:t>
-      </w:r>
-      <w:r>
-        <w:rPr>
+      <w:pPr>
+        <w:rPr>
+          <w:rFonts w:ascii="Times New Roman" w:hAnsi="Times New Roman" w:cs="Times New Roman"/>
+        </w:rPr>
+      </w:pPr>
+      <w:r>
+        <w:rPr>
+          <w:rFonts w:ascii="Times New Roman" w:hAnsi="Times New Roman" w:cs="Times New Roman"/>
+        </w:rPr>
+        <w:t xml:space="preserve">Tanév/félév: </w:t>
+      </w:r>
+      <w:r>
+        <w:rPr>
+          <w:rFonts w:ascii="Times New Roman" w:hAnsi="Times New Roman" w:cs="Times New Roman"/>
           <w:b/>
           <w:bCs/>
         </w:rPr>
@@ -117,105 +145,313 @@
       </w:r>
     </w:p>
     <w:p>
-      <w:r>
+      <w:pPr>
+        <w:rPr>
+          <w:rFonts w:ascii="Times New Roman" w:hAnsi="Times New Roman" w:cs="Times New Roman"/>
+        </w:rPr>
+      </w:pPr>
+      <w:r>
+        <w:rPr>
+          <w:rFonts w:ascii="Times New Roman" w:hAnsi="Times New Roman" w:cs="Times New Roman"/>
+        </w:rPr>
         <w:t xml:space="preserve">Feladat/téma címe: </w:t>
       </w:r>
       <w:r>
         <w:rPr>
+          <w:rFonts w:ascii="Times New Roman" w:hAnsi="Times New Roman" w:cs="Times New Roman"/>
           <w:b/>
           <w:bCs/>
         </w:rPr>
         <w:t>Gráf Neurális Hálók (GNN) Alkalmazása Különböző Területeken</w:t>
       </w:r>
     </w:p>
-    <w:p/>
     <w:p>
       <w:pPr>
         <w:pStyle w:val="Cmsor2"/>
-      </w:pPr>
-      <w:r>
+        <w:rPr>
+          <w:rFonts w:ascii="Times New Roman" w:hAnsi="Times New Roman" w:cs="Times New Roman"/>
+        </w:rPr>
+      </w:pPr>
+      <w:r>
+        <w:rPr>
+          <w:rFonts w:ascii="Times New Roman" w:hAnsi="Times New Roman" w:cs="Times New Roman"/>
+        </w:rPr>
         <w:t>Tervezett munkafázisok a félév során</w:t>
       </w:r>
     </w:p>
     <w:p>
       <w:pPr>
+        <w:pStyle w:val="Cmsor2"/>
+        <w:rPr>
+          <w:rFonts w:ascii="Times New Roman" w:hAnsi="Times New Roman" w:cs="Times New Roman"/>
+        </w:rPr>
+      </w:pPr>
+      <w:r>
+        <w:rPr>
+          <w:rFonts w:ascii="Times New Roman" w:hAnsi="Times New Roman" w:cs="Times New Roman"/>
+        </w:rPr>
+        <w:t>Probléma</w:t>
+      </w:r>
+    </w:p>
+    <w:p>
+      <w:pPr>
+        <w:rPr>
+          <w:rFonts w:ascii="Times New Roman" w:hAnsi="Times New Roman" w:cs="Times New Roman"/>
+        </w:rPr>
+      </w:pPr>
+      <w:r>
+        <w:rPr>
+          <w:rFonts w:ascii="Times New Roman" w:hAnsi="Times New Roman" w:cs="Times New Roman"/>
+        </w:rPr>
+        <w:t xml:space="preserve">A megoldandó probléma páros gráfokban Stable </w:t>
+      </w:r>
+      <w:r>
+        <w:rPr>
+          <w:rFonts w:ascii="Times New Roman" w:hAnsi="Times New Roman" w:cs="Times New Roman"/>
+        </w:rPr>
+        <w:t>m</w:t>
+      </w:r>
+      <w:r>
+        <w:rPr>
+          <w:rFonts w:ascii="Times New Roman" w:hAnsi="Times New Roman" w:cs="Times New Roman"/>
+        </w:rPr>
+        <w:t>atching keresés és gráfokban Stable roommate probléma</w:t>
+      </w:r>
+      <w:r>
+        <w:rPr>
+          <w:rFonts w:ascii="Times New Roman" w:hAnsi="Times New Roman" w:cs="Times New Roman"/>
+        </w:rPr>
+        <w:t xml:space="preserve"> megoldásának keresése</w:t>
+      </w:r>
+      <w:r>
+        <w:rPr>
+          <w:rFonts w:ascii="Times New Roman" w:hAnsi="Times New Roman" w:cs="Times New Roman"/>
+        </w:rPr>
+        <w:t xml:space="preserve"> </w:t>
+      </w:r>
+      <w:r>
+        <w:rPr>
+          <w:rFonts w:ascii="Times New Roman" w:hAnsi="Times New Roman" w:cs="Times New Roman"/>
+        </w:rPr>
+        <w:t>gráf neurális hálók segítségével</w:t>
+      </w:r>
+      <w:r>
+        <w:rPr>
+          <w:rFonts w:ascii="Times New Roman" w:hAnsi="Times New Roman" w:cs="Times New Roman"/>
+        </w:rPr>
+        <w:t>.</w:t>
+      </w:r>
+    </w:p>
+    <w:p>
+      <w:pPr>
         <w:pStyle w:val="Cmsor3"/>
-      </w:pPr>
-      <w:r>
+        <w:rPr>
+          <w:rFonts w:ascii="Times New Roman" w:hAnsi="Times New Roman" w:cs="Times New Roman"/>
+        </w:rPr>
+      </w:pPr>
+      <w:r>
+        <w:rPr>
+          <w:rFonts w:ascii="Times New Roman" w:hAnsi="Times New Roman" w:cs="Times New Roman"/>
+        </w:rPr>
         <w:t>1-3. oktatási hét:</w:t>
       </w:r>
     </w:p>
     <w:p>
-      <w:r>
-        <w:t>GNN-</w:t>
-      </w:r>
-      <w:proofErr w:type="spellStart"/>
-      <w:r>
-        <w:t>ekkel</w:t>
-      </w:r>
-      <w:proofErr w:type="spellEnd"/>
-      <w:r>
-        <w:t xml:space="preserve"> való megismerkedés és a problém</w:t>
-      </w:r>
-      <w:r>
+      <w:pPr>
+        <w:rPr>
+          <w:rFonts w:ascii="Times New Roman" w:hAnsi="Times New Roman" w:cs="Times New Roman"/>
+        </w:rPr>
+      </w:pPr>
+      <w:r>
+        <w:rPr>
+          <w:rFonts w:ascii="Times New Roman" w:hAnsi="Times New Roman" w:cs="Times New Roman"/>
+        </w:rPr>
+        <w:t>GNN-ekkel való megismerkedés és a</w:t>
+      </w:r>
+      <w:r>
+        <w:rPr>
+          <w:rFonts w:ascii="Times New Roman" w:hAnsi="Times New Roman" w:cs="Times New Roman"/>
+        </w:rPr>
+        <w:t xml:space="preserve"> matematikai</w:t>
+      </w:r>
+      <w:r>
+        <w:rPr>
+          <w:rFonts w:ascii="Times New Roman" w:hAnsi="Times New Roman" w:cs="Times New Roman"/>
+        </w:rPr>
+        <w:t xml:space="preserve"> problém</w:t>
+      </w:r>
+      <w:r>
+        <w:rPr>
+          <w:rFonts w:ascii="Times New Roman" w:hAnsi="Times New Roman" w:cs="Times New Roman"/>
+        </w:rPr>
         <w:t>ák</w:t>
       </w:r>
       <w:r>
+        <w:rPr>
+          <w:rFonts w:ascii="Times New Roman" w:hAnsi="Times New Roman" w:cs="Times New Roman"/>
+        </w:rPr>
         <w:t xml:space="preserve"> részletes megismerése.</w:t>
       </w:r>
       <w:r>
+        <w:rPr>
+          <w:rFonts w:ascii="Times New Roman" w:hAnsi="Times New Roman" w:cs="Times New Roman"/>
+        </w:rPr>
+        <w:t xml:space="preserve"> Stable matching</w:t>
+      </w:r>
+      <w:r>
+        <w:rPr>
+          <w:rStyle w:val="Lbjegyzet-hivatkozs"/>
+          <w:rFonts w:ascii="Times New Roman" w:hAnsi="Times New Roman" w:cs="Times New Roman"/>
+        </w:rPr>
+        <w:footnoteReference w:id="1"/>
+      </w:r>
+      <w:r>
+        <w:rPr>
+          <w:rFonts w:ascii="Times New Roman" w:hAnsi="Times New Roman" w:cs="Times New Roman"/>
+        </w:rPr>
         <w:t xml:space="preserve"> </w:t>
       </w:r>
-      <w:proofErr w:type="spellStart"/>
-      <w:r>
-        <w:t>Stable</w:t>
-      </w:r>
-      <w:proofErr w:type="spellEnd"/>
-      <w:r>
+      <w:r>
+        <w:rPr>
+          <w:rFonts w:ascii="Times New Roman" w:hAnsi="Times New Roman" w:cs="Times New Roman"/>
+        </w:rPr>
+        <w:t>és Stable roo</w:t>
+      </w:r>
+      <w:r>
+        <w:rPr>
+          <w:rFonts w:ascii="Times New Roman" w:hAnsi="Times New Roman" w:cs="Times New Roman"/>
+        </w:rPr>
+        <w:t>mm</w:t>
+      </w:r>
+      <w:r>
+        <w:rPr>
+          <w:rFonts w:ascii="Times New Roman" w:hAnsi="Times New Roman" w:cs="Times New Roman"/>
+        </w:rPr>
+        <w:t>ate</w:t>
+      </w:r>
+      <w:r>
+        <w:rPr>
+          <w:rStyle w:val="Lbjegyzet-hivatkozs"/>
+          <w:rFonts w:ascii="Times New Roman" w:hAnsi="Times New Roman" w:cs="Times New Roman"/>
+        </w:rPr>
+        <w:footnoteReference w:id="2"/>
+      </w:r>
+      <w:r>
+        <w:rPr>
+          <w:rFonts w:ascii="Times New Roman" w:hAnsi="Times New Roman" w:cs="Times New Roman"/>
+        </w:rPr>
+        <w:t xml:space="preserve"> probléma megismerése az Algoritmikus játékelmélet c. tárgy jegyzete ala</w:t>
+      </w:r>
+      <w:r>
+        <w:rPr>
+          <w:rFonts w:ascii="Times New Roman" w:hAnsi="Times New Roman" w:cs="Times New Roman"/>
+        </w:rPr>
+        <w:t>p</w:t>
+      </w:r>
+      <w:r>
+        <w:rPr>
+          <w:rFonts w:ascii="Times New Roman" w:hAnsi="Times New Roman" w:cs="Times New Roman"/>
+        </w:rPr>
+        <w:t>ján és Wikipédia alapján. GNN modellek megismerése Wikip</w:t>
+      </w:r>
+      <w:r>
+        <w:rPr>
+          <w:rFonts w:ascii="Times New Roman" w:hAnsi="Times New Roman" w:cs="Times New Roman"/>
+        </w:rPr>
+        <w:t>é</w:t>
+      </w:r>
+      <w:r>
+        <w:rPr>
+          <w:rFonts w:ascii="Times New Roman" w:hAnsi="Times New Roman" w:cs="Times New Roman"/>
+        </w:rPr>
+        <w:t>dia</w:t>
+      </w:r>
+      <w:r>
+        <w:rPr>
+          <w:rFonts w:ascii="Times New Roman" w:hAnsi="Times New Roman" w:cs="Times New Roman"/>
+        </w:rPr>
+        <w:t>,</w:t>
+      </w:r>
+      <w:r>
+        <w:rPr>
+          <w:rFonts w:ascii="Times New Roman" w:hAnsi="Times New Roman" w:cs="Times New Roman"/>
+        </w:rPr>
+        <w:t xml:space="preserve"> online videóanyagok</w:t>
+      </w:r>
+      <w:r>
+        <w:rPr>
+          <w:rFonts w:ascii="Times New Roman" w:hAnsi="Times New Roman" w:cs="Times New Roman"/>
+        </w:rPr>
+        <w:t>, és a Geometriai és topol</w:t>
+      </w:r>
+      <w:r>
+        <w:rPr>
+          <w:rFonts w:ascii="Times New Roman" w:hAnsi="Times New Roman" w:cs="Times New Roman"/>
+        </w:rPr>
+        <w:t>o</w:t>
+      </w:r>
+      <w:r>
+        <w:rPr>
+          <w:rFonts w:ascii="Times New Roman" w:hAnsi="Times New Roman" w:cs="Times New Roman"/>
+        </w:rPr>
+        <w:t>gikus mélytanulás</w:t>
+      </w:r>
+      <w:r>
+        <w:rPr>
+          <w:rFonts w:ascii="Times New Roman" w:hAnsi="Times New Roman" w:cs="Times New Roman"/>
+        </w:rPr>
         <w:t xml:space="preserve"> </w:t>
       </w:r>
-      <w:proofErr w:type="spellStart"/>
-      <w:r>
-        <w:t>matching</w:t>
-      </w:r>
-      <w:proofErr w:type="spellEnd"/>
-      <w:r>
-        <w:t xml:space="preserve"> és </w:t>
-      </w:r>
-      <w:proofErr w:type="spellStart"/>
-      <w:r>
-        <w:t>Stable</w:t>
-      </w:r>
-      <w:proofErr w:type="spellEnd"/>
-      <w:r>
-        <w:t xml:space="preserve"> </w:t>
-      </w:r>
-      <w:proofErr w:type="spellStart"/>
-      <w:r>
-        <w:t>roomate</w:t>
-      </w:r>
-      <w:proofErr w:type="spellEnd"/>
-      <w:r>
-        <w:t xml:space="preserve"> probléma megismerése az Algoritmikus játékelmélet c. tárgy jegyzete ala</w:t>
-      </w:r>
-      <w:r>
-        <w:t>p</w:t>
-      </w:r>
-      <w:r>
-        <w:t>ján és Wikipédia alapján. GNN modellek megismerése Wikipedia és online videóanyagok segítségével.</w:t>
+      <w:r>
+        <w:rPr>
+          <w:rFonts w:ascii="Times New Roman" w:hAnsi="Times New Roman" w:cs="Times New Roman"/>
+        </w:rPr>
+        <w:t xml:space="preserve">c. tárgy anyaginak </w:t>
+      </w:r>
+      <w:r>
+        <w:rPr>
+          <w:rFonts w:ascii="Times New Roman" w:hAnsi="Times New Roman" w:cs="Times New Roman"/>
+        </w:rPr>
+        <w:t>segítségével.</w:t>
+      </w:r>
+      <w:r>
+        <w:rPr>
+          <w:rFonts w:ascii="Times New Roman" w:hAnsi="Times New Roman" w:cs="Times New Roman"/>
+        </w:rPr>
+        <w:t xml:space="preserve"> A problémákkal kapcsolatos érdeklődés felmérése cikkek és publikációk alapján.</w:t>
       </w:r>
     </w:p>
     <w:p>
       <w:pPr>
         <w:pStyle w:val="Cmsor3"/>
-      </w:pPr>
-      <w:r>
+        <w:rPr>
+          <w:rFonts w:ascii="Times New Roman" w:hAnsi="Times New Roman" w:cs="Times New Roman"/>
+        </w:rPr>
+      </w:pPr>
+      <w:r>
+        <w:rPr>
+          <w:rFonts w:ascii="Times New Roman" w:hAnsi="Times New Roman" w:cs="Times New Roman"/>
+        </w:rPr>
         <w:t>4-5. oktatási hét:</w:t>
       </w:r>
     </w:p>
     <w:p>
-      <w:r>
-        <w:t>A probléma megoldásának megtervezése.</w:t>
+      <w:pPr>
+        <w:rPr>
+          <w:rFonts w:ascii="Times New Roman" w:hAnsi="Times New Roman" w:cs="Times New Roman"/>
+        </w:rPr>
+      </w:pPr>
+      <w:r>
+        <w:rPr>
+          <w:rFonts w:ascii="Times New Roman" w:hAnsi="Times New Roman" w:cs="Times New Roman"/>
+        </w:rPr>
+        <w:t>A probléma megoldásának megtervezése</w:t>
+      </w:r>
+      <w:r>
+        <w:rPr>
+          <w:rFonts w:ascii="Times New Roman" w:hAnsi="Times New Roman" w:cs="Times New Roman"/>
+        </w:rPr>
+        <w:t>.</w:t>
       </w:r>
     </w:p>
     <w:p>
@@ -225,11 +461,20 @@
           <w:ilvl w:val="0"/>
           <w:numId w:val="1"/>
         </w:numPr>
-      </w:pPr>
-      <w:r>
+        <w:rPr>
+          <w:rFonts w:ascii="Times New Roman" w:hAnsi="Times New Roman" w:cs="Times New Roman"/>
+        </w:rPr>
+      </w:pPr>
+      <w:r>
+        <w:rPr>
+          <w:rFonts w:ascii="Times New Roman" w:hAnsi="Times New Roman" w:cs="Times New Roman"/>
+        </w:rPr>
         <w:t>Konkrét GNN modell választása</w:t>
       </w:r>
       <w:r>
+        <w:rPr>
+          <w:rFonts w:ascii="Times New Roman" w:hAnsi="Times New Roman" w:cs="Times New Roman"/>
+        </w:rPr>
         <w:t>.</w:t>
       </w:r>
     </w:p>
@@ -240,9 +485,27 @@
           <w:ilvl w:val="0"/>
           <w:numId w:val="1"/>
         </w:numPr>
-      </w:pPr>
-      <w:r>
-        <w:t>A probléma megoldásának módja: Létrehozunk tanító adathalmazt szintetikusan elkészített gráfokkal majd a problémához megfelelő algoritmussal felcímkézzük őket, hogy felügyelt tanítást végezhessünk rajtuk.</w:t>
+        <w:rPr>
+          <w:rFonts w:ascii="Times New Roman" w:hAnsi="Times New Roman" w:cs="Times New Roman"/>
+        </w:rPr>
+      </w:pPr>
+      <w:r>
+        <w:rPr>
+          <w:rFonts w:ascii="Times New Roman" w:hAnsi="Times New Roman" w:cs="Times New Roman"/>
+        </w:rPr>
+        <w:t>A probléma megoldásának módja: Létrehozunk tanító adathalmazt szintetikusan elkészített gráfokkal majd a problémához megfelelő</w:t>
+      </w:r>
+      <w:r>
+        <w:rPr>
+          <w:rFonts w:ascii="Times New Roman" w:hAnsi="Times New Roman" w:cs="Times New Roman"/>
+        </w:rPr>
+        <w:t xml:space="preserve"> már ismert</w:t>
+      </w:r>
+      <w:r>
+        <w:rPr>
+          <w:rFonts w:ascii="Times New Roman" w:hAnsi="Times New Roman" w:cs="Times New Roman"/>
+        </w:rPr>
+        <w:t xml:space="preserve"> algoritmussal felcímkézzük őket, hogy felügyelt tanítást végezhessünk rajtuk.</w:t>
       </w:r>
     </w:p>
     <w:p>
@@ -252,192 +515,427 @@
           <w:ilvl w:val="0"/>
           <w:numId w:val="1"/>
         </w:numPr>
-      </w:pPr>
-      <w:r>
-        <w:t>Kiértékelés: az eredményeket az előbb említett algoritmusok segítségével kiértékelhetjük és jósági mutatókat készíthetünk a modellhez.</w:t>
+        <w:rPr>
+          <w:rFonts w:ascii="Times New Roman" w:hAnsi="Times New Roman" w:cs="Times New Roman"/>
+        </w:rPr>
+      </w:pPr>
+      <w:r>
+        <w:rPr>
+          <w:rFonts w:ascii="Times New Roman" w:hAnsi="Times New Roman" w:cs="Times New Roman"/>
+        </w:rPr>
+        <w:t>Kiértékelés: az eredményeket az előbb említett algoritmusok segítségével kiértékelhetjük és jósági mutatókat készíthetünk a modellhez</w:t>
+      </w:r>
+      <w:r>
+        <w:rPr>
+          <w:rFonts w:ascii="Times New Roman" w:hAnsi="Times New Roman" w:cs="Times New Roman"/>
+        </w:rPr>
+        <w:t xml:space="preserve"> (konfúziós mátrix)</w:t>
+      </w:r>
+      <w:r>
+        <w:rPr>
+          <w:rFonts w:ascii="Times New Roman" w:hAnsi="Times New Roman" w:cs="Times New Roman"/>
+        </w:rPr>
+        <w:t>.</w:t>
       </w:r>
     </w:p>
     <w:p>
       <w:pPr>
         <w:pStyle w:val="Cmsor3"/>
-      </w:pPr>
-      <w:r>
+        <w:rPr>
+          <w:rFonts w:ascii="Times New Roman" w:hAnsi="Times New Roman" w:cs="Times New Roman"/>
+        </w:rPr>
+      </w:pPr>
+      <w:r>
+        <w:rPr>
+          <w:rFonts w:ascii="Times New Roman" w:hAnsi="Times New Roman" w:cs="Times New Roman"/>
+        </w:rPr>
         <w:t>5-8. oktatási hét:</w:t>
       </w:r>
     </w:p>
     <w:p>
-      <w:r>
+      <w:pPr>
+        <w:rPr>
+          <w:rFonts w:ascii="Times New Roman" w:hAnsi="Times New Roman" w:cs="Times New Roman"/>
+        </w:rPr>
+      </w:pPr>
+      <w:r>
+        <w:rPr>
+          <w:rFonts w:ascii="Times New Roman" w:hAnsi="Times New Roman" w:cs="Times New Roman"/>
+        </w:rPr>
         <w:t xml:space="preserve">A </w:t>
       </w:r>
       <w:r>
+        <w:rPr>
+          <w:rFonts w:ascii="Times New Roman" w:hAnsi="Times New Roman" w:cs="Times New Roman"/>
+        </w:rPr>
         <w:t>probléma megoldásához szükséges eszközök</w:t>
       </w:r>
       <w:r>
+        <w:rPr>
+          <w:rFonts w:ascii="Times New Roman" w:hAnsi="Times New Roman" w:cs="Times New Roman"/>
+        </w:rPr>
         <w:t xml:space="preserve"> implementálása Python 3.11-ben. </w:t>
       </w:r>
       <w:r>
-        <w:t xml:space="preserve">A modellt </w:t>
-      </w:r>
-      <w:proofErr w:type="spellStart"/>
-      <w:r>
-        <w:t>PyTorch</w:t>
-      </w:r>
-      <w:proofErr w:type="spellEnd"/>
-      <w:r>
+        <w:rPr>
+          <w:rFonts w:ascii="Times New Roman" w:hAnsi="Times New Roman" w:cs="Times New Roman"/>
+        </w:rPr>
+        <w:t>A modellt PyTorch Geometric könyvtár segítségével hozzuk létre. A gráfok implementá</w:t>
+      </w:r>
+      <w:r>
+        <w:rPr>
+          <w:rFonts w:ascii="Times New Roman" w:hAnsi="Times New Roman" w:cs="Times New Roman"/>
+        </w:rPr>
+        <w:t>lásához</w:t>
+      </w:r>
+      <w:r>
+        <w:rPr>
+          <w:rFonts w:ascii="Times New Roman" w:hAnsi="Times New Roman" w:cs="Times New Roman"/>
+        </w:rPr>
         <w:t xml:space="preserve"> </w:t>
       </w:r>
-      <w:proofErr w:type="spellStart"/>
-      <w:r>
-        <w:t>Geometric</w:t>
-      </w:r>
-      <w:proofErr w:type="spellEnd"/>
-      <w:r>
-        <w:t xml:space="preserve"> könyvtár segítségével hozzuk létre. A gráfok implementá</w:t>
-      </w:r>
-      <w:r>
-        <w:t>lásához</w:t>
-      </w:r>
-      <w:r>
+      <w:r>
+        <w:rPr>
+          <w:rFonts w:ascii="Times New Roman" w:hAnsi="Times New Roman" w:cs="Times New Roman"/>
+        </w:rPr>
+        <w:lastRenderedPageBreak/>
+        <w:t>NetworkX könyvtárt használunk. A címkéző algoritmusokat alap könyvtárak (math, random) segítségével implementáljuk. A tanító adatokat alap könyvtárak segítségével létrehozzuk.</w:t>
+      </w:r>
+    </w:p>
+    <w:p>
+      <w:pPr>
+        <w:pStyle w:val="Cmsor3"/>
+        <w:rPr>
+          <w:rFonts w:ascii="Times New Roman" w:hAnsi="Times New Roman" w:cs="Times New Roman"/>
+        </w:rPr>
+      </w:pPr>
+      <w:r>
+        <w:rPr>
+          <w:rFonts w:ascii="Times New Roman" w:hAnsi="Times New Roman" w:cs="Times New Roman"/>
+        </w:rPr>
+        <w:t>9-10. oktatási hét:</w:t>
+      </w:r>
+    </w:p>
+    <w:p>
+      <w:pPr>
+        <w:rPr>
+          <w:rFonts w:ascii="Times New Roman" w:hAnsi="Times New Roman" w:cs="Times New Roman"/>
+        </w:rPr>
+      </w:pPr>
+      <w:r>
+        <w:rPr>
+          <w:rFonts w:ascii="Times New Roman" w:hAnsi="Times New Roman" w:cs="Times New Roman"/>
+        </w:rPr>
+        <w:t>Teszte</w:t>
+      </w:r>
+      <w:r>
+        <w:rPr>
+          <w:rFonts w:ascii="Times New Roman" w:hAnsi="Times New Roman" w:cs="Times New Roman"/>
+        </w:rPr>
+        <w:t>k</w:t>
+      </w:r>
+      <w:r>
+        <w:rPr>
+          <w:rFonts w:ascii="Times New Roman" w:hAnsi="Times New Roman" w:cs="Times New Roman"/>
+        </w:rPr>
+        <w:t xml:space="preserve"> arra, hogy</w:t>
+      </w:r>
+      <w:r>
+        <w:rPr>
+          <w:rFonts w:ascii="Times New Roman" w:hAnsi="Times New Roman" w:cs="Times New Roman"/>
+        </w:rPr>
         <w:t xml:space="preserve"> </w:t>
       </w:r>
-      <w:proofErr w:type="spellStart"/>
-      <w:r>
-        <w:t>NetworkX</w:t>
-      </w:r>
-      <w:proofErr w:type="spellEnd"/>
-      <w:r>
-        <w:t xml:space="preserve"> könyvtárt használunk. A címkéző algoritmusokat alap könyvtárak (</w:t>
-      </w:r>
-      <w:proofErr w:type="spellStart"/>
-      <w:r>
-        <w:t>math</w:t>
-      </w:r>
-      <w:proofErr w:type="spellEnd"/>
-      <w:r>
-        <w:t>, random) segítségével implementáljuk. A tanító adatokat alap könyvtárak segítségével létrehozzuk.</w:t>
+      <w:r>
+        <w:rPr>
+          <w:rFonts w:ascii="Times New Roman" w:hAnsi="Times New Roman" w:cs="Times New Roman"/>
+        </w:rPr>
+        <w:t>a</w:t>
+      </w:r>
+      <w:r>
+        <w:rPr>
+          <w:rFonts w:ascii="Times New Roman" w:hAnsi="Times New Roman" w:cs="Times New Roman"/>
+        </w:rPr>
+        <w:t>z adatgenerálás megfelelő adatokat hoz</w:t>
+      </w:r>
+      <w:r>
+        <w:rPr>
+          <w:rFonts w:ascii="Times New Roman" w:hAnsi="Times New Roman" w:cs="Times New Roman"/>
+        </w:rPr>
+        <w:t>-e</w:t>
+      </w:r>
+      <w:r>
+        <w:rPr>
+          <w:rFonts w:ascii="Times New Roman" w:hAnsi="Times New Roman" w:cs="Times New Roman"/>
+        </w:rPr>
+        <w:t xml:space="preserve"> létre, a modell milyen esetekre és mennyire működik jól.</w:t>
+      </w:r>
+    </w:p>
+    <w:p>
+      <w:pPr>
+        <w:rPr>
+          <w:rFonts w:ascii="Times New Roman" w:hAnsi="Times New Roman" w:cs="Times New Roman"/>
+        </w:rPr>
+      </w:pPr>
+      <w:r>
+        <w:rPr>
+          <w:rFonts w:ascii="Times New Roman" w:hAnsi="Times New Roman" w:cs="Times New Roman"/>
+        </w:rPr>
+        <w:t>A</w:t>
+      </w:r>
+      <w:r>
+        <w:rPr>
+          <w:rFonts w:ascii="Times New Roman" w:hAnsi="Times New Roman" w:cs="Times New Roman"/>
+        </w:rPr>
+        <w:t xml:space="preserve"> szintetikus</w:t>
+      </w:r>
+      <w:r>
+        <w:rPr>
+          <w:rFonts w:ascii="Times New Roman" w:hAnsi="Times New Roman" w:cs="Times New Roman"/>
+        </w:rPr>
+        <w:t xml:space="preserve"> adatok</w:t>
+      </w:r>
+      <w:r>
+        <w:rPr>
+          <w:rFonts w:ascii="Times New Roman" w:hAnsi="Times New Roman" w:cs="Times New Roman"/>
+        </w:rPr>
+        <w:t xml:space="preserve"> tesztelés</w:t>
+      </w:r>
+      <w:r>
+        <w:rPr>
+          <w:rFonts w:ascii="Times New Roman" w:hAnsi="Times New Roman" w:cs="Times New Roman"/>
+        </w:rPr>
+        <w:t>ét</w:t>
+      </w:r>
+      <w:r>
+        <w:rPr>
+          <w:rFonts w:ascii="Times New Roman" w:hAnsi="Times New Roman" w:cs="Times New Roman"/>
+        </w:rPr>
+        <w:t xml:space="preserve"> elvégez</w:t>
+      </w:r>
+      <w:r>
+        <w:rPr>
+          <w:rFonts w:ascii="Times New Roman" w:hAnsi="Times New Roman" w:cs="Times New Roman"/>
+        </w:rPr>
+        <w:t>zük</w:t>
+      </w:r>
+      <w:r>
+        <w:rPr>
+          <w:rFonts w:ascii="Times New Roman" w:hAnsi="Times New Roman" w:cs="Times New Roman"/>
+        </w:rPr>
+        <w:t xml:space="preserve"> már létező algoritmusokkal (Gale-Shap</w:t>
+      </w:r>
+      <w:r>
+        <w:rPr>
+          <w:rFonts w:ascii="Times New Roman" w:hAnsi="Times New Roman" w:cs="Times New Roman"/>
+        </w:rPr>
+        <w:t>le</w:t>
+      </w:r>
+      <w:r>
+        <w:rPr>
+          <w:rFonts w:ascii="Times New Roman" w:hAnsi="Times New Roman" w:cs="Times New Roman"/>
+        </w:rPr>
+        <w:t>y)</w:t>
+      </w:r>
+      <w:r>
+        <w:rPr>
+          <w:rFonts w:ascii="Times New Roman" w:hAnsi="Times New Roman" w:cs="Times New Roman"/>
+        </w:rPr>
+        <w:t xml:space="preserve">, a </w:t>
+      </w:r>
+      <w:r>
+        <w:rPr>
+          <w:rFonts w:ascii="Times New Roman" w:hAnsi="Times New Roman" w:cs="Times New Roman"/>
+        </w:rPr>
+        <w:t>modell</w:t>
+      </w:r>
+      <w:r>
+        <w:rPr>
+          <w:rFonts w:ascii="Times New Roman" w:hAnsi="Times New Roman" w:cs="Times New Roman"/>
+        </w:rPr>
+        <w:t xml:space="preserve">t </w:t>
+      </w:r>
+      <w:r>
+        <w:rPr>
+          <w:rFonts w:ascii="Times New Roman" w:hAnsi="Times New Roman" w:cs="Times New Roman"/>
+        </w:rPr>
+        <w:t xml:space="preserve">pedig a </w:t>
+      </w:r>
+      <w:r>
+        <w:rPr>
+          <w:rFonts w:ascii="Times New Roman" w:hAnsi="Times New Roman" w:cs="Times New Roman"/>
+        </w:rPr>
+        <w:t>konfúziós</w:t>
+      </w:r>
+      <w:r>
+        <w:rPr>
+          <w:rFonts w:ascii="Times New Roman" w:hAnsi="Times New Roman" w:cs="Times New Roman"/>
+        </w:rPr>
+        <w:t xml:space="preserve"> mátrix segítségével </w:t>
+      </w:r>
+      <w:r>
+        <w:rPr>
+          <w:rFonts w:ascii="Times New Roman" w:hAnsi="Times New Roman" w:cs="Times New Roman"/>
+        </w:rPr>
+        <w:t>értékeljük ki</w:t>
+      </w:r>
+      <w:r>
+        <w:rPr>
+          <w:rFonts w:ascii="Times New Roman" w:hAnsi="Times New Roman" w:cs="Times New Roman"/>
+        </w:rPr>
+        <w:t>.</w:t>
       </w:r>
     </w:p>
     <w:p>
       <w:pPr>
         <w:pStyle w:val="Cmsor3"/>
-      </w:pPr>
-      <w:r>
-        <w:t>9-10. oktatási hét:</w:t>
-      </w:r>
-    </w:p>
-    <w:p>
-      <w:r>
-        <w:t>Teszteljük, hogy az adatgenerálás megfelelő adatokat hoz létre, a modell milyen esetekre és mennyire működik jól.</w:t>
-      </w:r>
-    </w:p>
-    <w:p>
-      <w:r>
-        <w:lastRenderedPageBreak/>
-        <w:t>A</w:t>
-      </w:r>
-      <w:r>
-        <w:t xml:space="preserve"> szintetikus</w:t>
-      </w:r>
-      <w:r>
-        <w:t xml:space="preserve"> adatok</w:t>
-      </w:r>
-      <w:r>
-        <w:t xml:space="preserve"> tesztelés</w:t>
-      </w:r>
-      <w:r>
-        <w:t>ét</w:t>
-      </w:r>
-      <w:r>
-        <w:t xml:space="preserve"> elvégezhetjük már létező algoritmusokkal (</w:t>
-      </w:r>
-      <w:proofErr w:type="spellStart"/>
-      <w:r>
-        <w:t>Gale-Shapely</w:t>
-      </w:r>
-      <w:proofErr w:type="spellEnd"/>
-      <w:r>
-        <w:t>).</w:t>
-      </w:r>
-      <w:r>
-        <w:t xml:space="preserve"> A modell jóságát pedig a </w:t>
-      </w:r>
-      <w:proofErr w:type="spellStart"/>
-      <w:r>
-        <w:t>confusion</w:t>
-      </w:r>
-      <w:proofErr w:type="spellEnd"/>
-      <w:r>
-        <w:t xml:space="preserve"> mátrix segítségével fogjuk kiértékelni.</w:t>
+        <w:rPr>
+          <w:rFonts w:ascii="Times New Roman" w:hAnsi="Times New Roman" w:cs="Times New Roman"/>
+        </w:rPr>
+      </w:pPr>
+      <w:r>
+        <w:rPr>
+          <w:rFonts w:ascii="Times New Roman" w:hAnsi="Times New Roman" w:cs="Times New Roman"/>
+        </w:rPr>
+        <w:t>11. oktatási hét:</w:t>
+      </w:r>
+    </w:p>
+    <w:p>
+      <w:pPr>
+        <w:rPr>
+          <w:rFonts w:ascii="Times New Roman" w:hAnsi="Times New Roman" w:cs="Times New Roman"/>
+        </w:rPr>
+      </w:pPr>
+      <w:r>
+        <w:rPr>
+          <w:rFonts w:ascii="Times New Roman" w:hAnsi="Times New Roman" w:cs="Times New Roman"/>
+        </w:rPr>
+        <w:t>Különböző lokálisan futtatható LLM-ek kipróbálása a két problémán.</w:t>
+      </w:r>
+      <w:r>
+        <w:rPr>
+          <w:rFonts w:ascii="Times New Roman" w:hAnsi="Times New Roman" w:cs="Times New Roman"/>
+        </w:rPr>
+        <w:t xml:space="preserve"> </w:t>
+      </w:r>
+      <w:r>
+        <w:rPr>
+          <w:rFonts w:ascii="Times New Roman" w:hAnsi="Times New Roman" w:cs="Times New Roman"/>
+        </w:rPr>
+        <w:t>Írásbeli beszámoló elkészítése és átbeszélése.</w:t>
       </w:r>
     </w:p>
     <w:p>
       <w:pPr>
         <w:pStyle w:val="Cmsor3"/>
-      </w:pPr>
-      <w:r>
-        <w:t>11. oktatási hét:</w:t>
-      </w:r>
-    </w:p>
-    <w:p>
-      <w:r>
-        <w:t xml:space="preserve">Írásbeli beszámoló </w:t>
-      </w:r>
-      <w:r>
-        <w:t>elkészítése és átbeszélése.</w:t>
+        <w:rPr>
+          <w:rFonts w:ascii="Times New Roman" w:hAnsi="Times New Roman" w:cs="Times New Roman"/>
+        </w:rPr>
+      </w:pPr>
+      <w:r>
+        <w:rPr>
+          <w:rFonts w:ascii="Times New Roman" w:hAnsi="Times New Roman" w:cs="Times New Roman"/>
+        </w:rPr>
+        <w:t>12-13. oktatási hét:</w:t>
+      </w:r>
+    </w:p>
+    <w:p>
+      <w:pPr>
+        <w:rPr>
+          <w:rFonts w:ascii="Times New Roman" w:hAnsi="Times New Roman" w:cs="Times New Roman"/>
+        </w:rPr>
+      </w:pPr>
+      <w:r>
+        <w:rPr>
+          <w:rFonts w:ascii="Times New Roman" w:hAnsi="Times New Roman" w:cs="Times New Roman"/>
+        </w:rPr>
+        <w:t xml:space="preserve">A legalább egyszer iterált </w:t>
+      </w:r>
+      <w:r>
+        <w:rPr>
+          <w:rFonts w:ascii="Times New Roman" w:hAnsi="Times New Roman" w:cs="Times New Roman"/>
+        </w:rPr>
+        <w:t>í</w:t>
+      </w:r>
+      <w:r>
+        <w:rPr>
+          <w:rFonts w:ascii="Times New Roman" w:hAnsi="Times New Roman" w:cs="Times New Roman"/>
+        </w:rPr>
+        <w:t>rásbeli beszámoló végleges,</w:t>
+      </w:r>
+      <w:r>
+        <w:rPr>
+          <w:rFonts w:ascii="Times New Roman" w:hAnsi="Times New Roman" w:cs="Times New Roman"/>
+        </w:rPr>
+        <w:t xml:space="preserve"> </w:t>
+      </w:r>
+      <w:r>
+        <w:rPr>
+          <w:rFonts w:ascii="Times New Roman" w:hAnsi="Times New Roman" w:cs="Times New Roman"/>
+        </w:rPr>
+        <w:t>kijavított verziójának beadása, a szóbeli elkészít</w:t>
+      </w:r>
+      <w:r>
+        <w:rPr>
+          <w:rFonts w:ascii="Times New Roman" w:hAnsi="Times New Roman" w:cs="Times New Roman"/>
+        </w:rPr>
+        <w:t>é</w:t>
+      </w:r>
+      <w:r>
+        <w:rPr>
+          <w:rFonts w:ascii="Times New Roman" w:hAnsi="Times New Roman" w:cs="Times New Roman"/>
+        </w:rPr>
+        <w:t>se</w:t>
+      </w:r>
+      <w:r>
+        <w:rPr>
+          <w:rFonts w:ascii="Times New Roman" w:hAnsi="Times New Roman" w:cs="Times New Roman"/>
+        </w:rPr>
+        <w:t>.</w:t>
       </w:r>
     </w:p>
     <w:p>
       <w:pPr>
         <w:pStyle w:val="Cmsor3"/>
-      </w:pPr>
-      <w:r>
-        <w:t>12-13. oktatási hét:</w:t>
-      </w:r>
-    </w:p>
-    <w:p>
-      <w:r>
-        <w:t xml:space="preserve">A legalább egyszer iterált </w:t>
-      </w:r>
-      <w:r>
-        <w:t>í</w:t>
-      </w:r>
-      <w:r>
-        <w:t>rásbeli beszámoló végleges,</w:t>
-      </w:r>
-      <w:r>
+        <w:rPr>
+          <w:rFonts w:ascii="Times New Roman" w:hAnsi="Times New Roman" w:cs="Times New Roman"/>
+        </w:rPr>
+      </w:pPr>
+      <w:r>
+        <w:rPr>
+          <w:rFonts w:ascii="Times New Roman" w:hAnsi="Times New Roman" w:cs="Times New Roman"/>
+        </w:rPr>
+        <w:t>14. oktatási hét:</w:t>
+      </w:r>
+    </w:p>
+    <w:p>
+      <w:pPr>
+        <w:rPr>
+          <w:rFonts w:ascii="Times New Roman" w:hAnsi="Times New Roman" w:cs="Times New Roman"/>
+        </w:rPr>
+      </w:pPr>
+      <w:r>
+        <w:rPr>
+          <w:rFonts w:ascii="Times New Roman" w:hAnsi="Times New Roman" w:cs="Times New Roman"/>
+        </w:rPr>
         <w:t xml:space="preserve"> </w:t>
       </w:r>
       <w:r>
-        <w:t xml:space="preserve">kijavított verziójának beadása, a szóbeli </w:t>
-      </w:r>
-      <w:proofErr w:type="spellStart"/>
-      <w:r>
-        <w:t>elkészítese</w:t>
-      </w:r>
-      <w:proofErr w:type="spellEnd"/>
-      <w:r>
-        <w:t>.</w:t>
-      </w:r>
-    </w:p>
-    <w:p>
-      <w:pPr>
-        <w:pStyle w:val="Cmsor3"/>
-      </w:pPr>
-      <w:r>
-        <w:t>14. oktatási hét:</w:t>
-      </w:r>
-    </w:p>
-    <w:p>
-      <w:r>
-        <w:t xml:space="preserve">  </w:t>
-      </w:r>
-      <w:r>
+        <w:rPr>
+          <w:rFonts w:ascii="Times New Roman" w:hAnsi="Times New Roman" w:cs="Times New Roman"/>
+        </w:rPr>
         <w:t>S</w:t>
       </w:r>
       <w:r>
+        <w:rPr>
+          <w:rFonts w:ascii="Times New Roman" w:hAnsi="Times New Roman" w:cs="Times New Roman"/>
+        </w:rPr>
         <w:t>zóbeli gyakorló előadása</w:t>
       </w:r>
       <w:r>
+        <w:rPr>
+          <w:rFonts w:ascii="Times New Roman" w:hAnsi="Times New Roman" w:cs="Times New Roman"/>
+        </w:rPr>
         <w:t xml:space="preserve"> majd javítása, bemutatás.</w:t>
       </w:r>
     </w:p>
@@ -449,6 +947,104 @@
     </w:sectPr>
   </w:body>
 </w:document>
+</file>
+
+<file path=word/endnotes.xml><?xml version="1.0" encoding="utf-8"?>
+<w:endnotes xmlns:wpc="http://schemas.microsoft.com/office/word/2010/wordprocessingCanvas" xmlns:cx="http://schemas.microsoft.com/office/drawing/2014/chartex" xmlns:cx1="http://schemas.microsoft.com/office/drawing/2015/9/8/chartex" xmlns:cx2="http://schemas.microsoft.com/office/drawing/2015/10/21/chartex" xmlns:cx3="http://schemas.microsoft.com/office/drawing/2016/5/9/chartex" xmlns:cx4="http://schemas.microsoft.com/office/drawing/2016/5/10/chartex" xmlns:cx5="http://schemas.microsoft.com/office/drawing/2016/5/11/chartex" xmlns:cx6="http://schemas.microsoft.com/office/drawing/2016/5/12/chartex" xmlns:cx7="http://schemas.microsoft.com/office/drawing/2016/5/13/chartex" xmlns:cx8="http://schemas.microsoft.com/office/drawing/2016/5/14/chartex" xmlns:mc="http://schemas.openxmlformats.org/markup-compatibility/2006" xmlns:aink="http://schemas.microsoft.com/office/drawing/2016/ink" xmlns:am3d="http://schemas.microsoft.com/office/drawing/2017/model3d" xmlns:o="urn:schemas-microsoft-com:office:office" xmlns:oel="http://schemas.microsoft.com/office/2019/extlst" xmlns:r="http://schemas.openxmlformats.org/officeDocument/2006/relationships" xmlns:m="http://schemas.openxmlformats.org/officeDocument/2006/math" xmlns:v="urn:schemas-microsoft-com:vml" xmlns:wp14="http://schemas.microsoft.com/office/word/2010/wordprocessingDrawing" xmlns:wp="http://schemas.openxmlformats.org/drawingml/2006/wordprocessingDrawing" xmlns:w10="urn:schemas-microsoft-com:office:word" xmlns:w="http://schemas.openxmlformats.org/wordprocessingml/2006/main" xmlns:w14="http://schemas.microsoft.com/office/word/2010/wordml" xmlns:w15="http://schemas.microsoft.com/office/word/2012/wordml" xmlns:w16cex="http://schemas.microsoft.com/office/word/2018/wordml/cex" xmlns:w16cid="http://schemas.microsoft.com/office/word/2016/wordml/cid" xmlns:w16="http://schemas.microsoft.com/office/word/2018/wordml" xmlns:w16du="http://schemas.microsoft.com/office/word/2023/wordml/word16du" xmlns:w16sdtdh="http://schemas.microsoft.com/office/word/2020/wordml/sdtdatahash" xmlns:w16sdtfl="http://schemas.microsoft.com/office/word/2024/wordml/sdtformatlock" xmlns:w16se="http://schemas.microsoft.com/office/word/2015/wordml/symex" xmlns:wpg="http://schemas.microsoft.com/office/word/2010/wordprocessingGroup" xmlns:wpi="http://schemas.microsoft.com/office/word/2010/wordprocessingInk" xmlns:wne="http://schemas.microsoft.com/office/word/2006/wordml" xmlns:wps="http://schemas.microsoft.com/office/word/2010/wordprocessingShape" mc:Ignorable="w14 w15 w16se w16cid w16 w16cex w16sdtdh w16sdtfl w16du wp14">
+  <w:endnote w:type="separator" w:id="-1">
+    <w:p>
+      <w:pPr>
+        <w:spacing w:after="0" w:line="240" w:lineRule="auto"/>
+      </w:pPr>
+      <w:r>
+        <w:separator/>
+      </w:r>
+    </w:p>
+  </w:endnote>
+  <w:endnote w:type="continuationSeparator" w:id="0">
+    <w:p>
+      <w:pPr>
+        <w:spacing w:after="0" w:line="240" w:lineRule="auto"/>
+      </w:pPr>
+      <w:r>
+        <w:continuationSeparator/>
+      </w:r>
+    </w:p>
+  </w:endnote>
+</w:endnotes>
+</file>
+
+<file path=word/footnotes.xml><?xml version="1.0" encoding="utf-8"?>
+<w:footnotes xmlns:wpc="http://schemas.microsoft.com/office/word/2010/wordprocessingCanvas" xmlns:cx="http://schemas.microsoft.com/office/drawing/2014/chartex" xmlns:cx1="http://schemas.microsoft.com/office/drawing/2015/9/8/chartex" xmlns:cx2="http://schemas.microsoft.com/office/drawing/2015/10/21/chartex" xmlns:cx3="http://schemas.microsoft.com/office/drawing/2016/5/9/chartex" xmlns:cx4="http://schemas.microsoft.com/office/drawing/2016/5/10/chartex" xmlns:cx5="http://schemas.microsoft.com/office/drawing/2016/5/11/chartex" xmlns:cx6="http://schemas.microsoft.com/office/drawing/2016/5/12/chartex" xmlns:cx7="http://schemas.microsoft.com/office/drawing/2016/5/13/chartex" xmlns:cx8="http://schemas.microsoft.com/office/drawing/2016/5/14/chartex" xmlns:mc="http://schemas.openxmlformats.org/markup-compatibility/2006" xmlns:aink="http://schemas.microsoft.com/office/drawing/2016/ink" xmlns:am3d="http://schemas.microsoft.com/office/drawing/2017/model3d" xmlns:o="urn:schemas-microsoft-com:office:office" xmlns:oel="http://schemas.microsoft.com/office/2019/extlst" xmlns:r="http://schemas.openxmlformats.org/officeDocument/2006/relationships" xmlns:m="http://schemas.openxmlformats.org/officeDocument/2006/math" xmlns:v="urn:schemas-microsoft-com:vml" xmlns:wp14="http://schemas.microsoft.com/office/word/2010/wordprocessingDrawing" xmlns:wp="http://schemas.openxmlformats.org/drawingml/2006/wordprocessingDrawing" xmlns:w10="urn:schemas-microsoft-com:office:word" xmlns:w="http://schemas.openxmlformats.org/wordprocessingml/2006/main" xmlns:w14="http://schemas.microsoft.com/office/word/2010/wordml" xmlns:w15="http://schemas.microsoft.com/office/word/2012/wordml" xmlns:w16cex="http://schemas.microsoft.com/office/word/2018/wordml/cex" xmlns:w16cid="http://schemas.microsoft.com/office/word/2016/wordml/cid" xmlns:w16="http://schemas.microsoft.com/office/word/2018/wordml" xmlns:w16du="http://schemas.microsoft.com/office/word/2023/wordml/word16du" xmlns:w16sdtdh="http://schemas.microsoft.com/office/word/2020/wordml/sdtdatahash" xmlns:w16sdtfl="http://schemas.microsoft.com/office/word/2024/wordml/sdtformatlock" xmlns:w16se="http://schemas.microsoft.com/office/word/2015/wordml/symex" xmlns:wpg="http://schemas.microsoft.com/office/word/2010/wordprocessingGroup" xmlns:wpi="http://schemas.microsoft.com/office/word/2010/wordprocessingInk" xmlns:wne="http://schemas.microsoft.com/office/word/2006/wordml" xmlns:wps="http://schemas.microsoft.com/office/word/2010/wordprocessingShape" mc:Ignorable="w14 w15 w16se w16cid w16 w16cex w16sdtdh w16sdtfl w16du wp14">
+  <w:footnote w:type="separator" w:id="-1">
+    <w:p>
+      <w:pPr>
+        <w:spacing w:after="0" w:line="240" w:lineRule="auto"/>
+      </w:pPr>
+      <w:r>
+        <w:separator/>
+      </w:r>
+    </w:p>
+  </w:footnote>
+  <w:footnote w:type="continuationSeparator" w:id="0">
+    <w:p>
+      <w:pPr>
+        <w:spacing w:after="0" w:line="240" w:lineRule="auto"/>
+      </w:pPr>
+      <w:r>
+        <w:continuationSeparator/>
+      </w:r>
+    </w:p>
+  </w:footnote>
+  <w:footnote w:id="1">
+    <w:p>
+      <w:pPr>
+        <w:pStyle w:val="Lbjegyzetszveg"/>
+      </w:pPr>
+      <w:r>
+        <w:rPr>
+          <w:rStyle w:val="Lbjegyzet-hivatkozs"/>
+        </w:rPr>
+        <w:footnoteRef/>
+      </w:r>
+      <w:r>
+        <w:t xml:space="preserve"> </w:t>
+      </w:r>
+      <w:hyperlink r:id="rId1" w:history="1">
+        <w:r>
+          <w:rPr>
+            <w:rStyle w:val="Hiperhivatkozs"/>
+          </w:rPr>
+          <w:t>https://en.wikipedia.org/wiki/Stable_matching_problem</w:t>
+        </w:r>
+      </w:hyperlink>
+    </w:p>
+  </w:footnote>
+  <w:footnote w:id="2">
+    <w:p>
+      <w:pPr>
+        <w:pStyle w:val="Lbjegyzetszveg"/>
+      </w:pPr>
+      <w:r>
+        <w:rPr>
+          <w:rStyle w:val="Lbjegyzet-hivatkozs"/>
+        </w:rPr>
+        <w:footnoteRef/>
+      </w:r>
+      <w:r>
+        <w:t xml:space="preserve"> </w:t>
+      </w:r>
+      <w:hyperlink r:id="rId2" w:history="1">
+        <w:r>
+          <w:rPr>
+            <w:rStyle w:val="Hiperhivatkozs"/>
+          </w:rPr>
+          <w:t>https://en.wikipedia.org/wiki/Stable_roommates_problem</w:t>
+        </w:r>
+      </w:hyperlink>
+    </w:p>
+  </w:footnote>
+</w:footnotes>
 </file>
 
 <file path=word/numbering.xml><?xml version="1.0" encoding="utf-8"?>
@@ -972,6 +1568,7 @@
   <w:style w:type="paragraph" w:default="1" w:styleId="Norml">
     <w:name w:val="Normal"/>
     <w:qFormat/>
+    <w:rsid w:val="00033C50"/>
   </w:style>
   <w:style w:type="paragraph" w:styleId="Cmsor1">
     <w:name w:val="heading 1"/>
@@ -1173,6 +1770,7 @@
   <w:style w:type="character" w:default="1" w:styleId="Bekezdsalapbettpusa">
     <w:name w:val="Default Paragraph Font"/>
     <w:uiPriority w:val="1"/>
+    <w:semiHidden/>
     <w:unhideWhenUsed/>
   </w:style>
   <w:style w:type="table" w:default="1" w:styleId="Normltblzat">
@@ -1482,6 +2080,80 @@
       <w:smallCaps/>
       <w:color w:val="0F4761" w:themeColor="accent1" w:themeShade="BF"/>
       <w:spacing w:val="5"/>
+    </w:rPr>
+  </w:style>
+  <w:style w:type="paragraph" w:styleId="Lbjegyzetszveg">
+    <w:name w:val="footnote text"/>
+    <w:basedOn w:val="Norml"/>
+    <w:link w:val="LbjegyzetszvegChar"/>
+    <w:uiPriority w:val="99"/>
+    <w:semiHidden/>
+    <w:unhideWhenUsed/>
+    <w:rsid w:val="00EB5290"/>
+    <w:pPr>
+      <w:spacing w:after="0" w:line="240" w:lineRule="auto"/>
+    </w:pPr>
+    <w:rPr>
+      <w:sz w:val="20"/>
+      <w:szCs w:val="20"/>
+    </w:rPr>
+  </w:style>
+  <w:style w:type="character" w:customStyle="1" w:styleId="LbjegyzetszvegChar">
+    <w:name w:val="Lábjegyzetszöveg Char"/>
+    <w:basedOn w:val="Bekezdsalapbettpusa"/>
+    <w:link w:val="Lbjegyzetszveg"/>
+    <w:uiPriority w:val="99"/>
+    <w:semiHidden/>
+    <w:rsid w:val="00EB5290"/>
+    <w:rPr>
+      <w:sz w:val="20"/>
+      <w:szCs w:val="20"/>
+    </w:rPr>
+  </w:style>
+  <w:style w:type="character" w:styleId="Lbjegyzet-hivatkozs">
+    <w:name w:val="footnote reference"/>
+    <w:basedOn w:val="Bekezdsalapbettpusa"/>
+    <w:uiPriority w:val="99"/>
+    <w:semiHidden/>
+    <w:unhideWhenUsed/>
+    <w:rsid w:val="00EB5290"/>
+    <w:rPr>
+      <w:vertAlign w:val="superscript"/>
+    </w:rPr>
+  </w:style>
+  <w:style w:type="character" w:styleId="Hiperhivatkozs">
+    <w:name w:val="Hyperlink"/>
+    <w:basedOn w:val="Bekezdsalapbettpusa"/>
+    <w:uiPriority w:val="99"/>
+    <w:unhideWhenUsed/>
+    <w:rsid w:val="00EB5290"/>
+    <w:rPr>
+      <w:color w:val="467886" w:themeColor="hyperlink"/>
+      <w:u w:val="single"/>
+    </w:rPr>
+  </w:style>
+  <w:style w:type="character" w:styleId="Feloldatlanmegemlts">
+    <w:name w:val="Unresolved Mention"/>
+    <w:basedOn w:val="Bekezdsalapbettpusa"/>
+    <w:uiPriority w:val="99"/>
+    <w:semiHidden/>
+    <w:unhideWhenUsed/>
+    <w:rsid w:val="00EB5290"/>
+    <w:rPr>
+      <w:color w:val="605E5C"/>
+      <w:shd w:val="clear" w:color="auto" w:fill="E1DFDD"/>
+    </w:rPr>
+  </w:style>
+  <w:style w:type="character" w:styleId="Mrltotthiperhivatkozs">
+    <w:name w:val="FollowedHyperlink"/>
+    <w:basedOn w:val="Bekezdsalapbettpusa"/>
+    <w:uiPriority w:val="99"/>
+    <w:semiHidden/>
+    <w:unhideWhenUsed/>
+    <w:rsid w:val="00EB5290"/>
+    <w:rPr>
+      <w:color w:val="96607D" w:themeColor="followedHyperlink"/>
+      <w:u w:val="single"/>
     </w:rPr>
   </w:style>
 </w:styles>

</xml_diff>